<commit_message>
Add key metric comparison tables for each session note
Surface baseline vs improved metrics and deltas in Word docs so
insight PPT work can reuse quantitative comparison pages.

Co-authored-by: Annie <Annie-Summer@users.noreply.github.com>
</commit_message>
<xml_diff>
--- a/yunqi-2026-cipu-forum/docs/00-论坛级洞察提纲-洞察PPT素材.docx
+++ b/yunqi-2026-cipu-forum/docs/00-论坛级洞察提纲-洞察PPT素材.docx
@@ -254,7 +254,900 @@
           <w:b/>
           <w:sz w:val="26"/>
         </w:rPr>
-        <w:t>三、技术展开与PPT佐证</w:t>
+        <w:t>三、关键技术指标对比与提升</w:t>
+      </w:r>
+    </w:p>
+    <w:p>
+      <w:pPr>
+        <w:spacing w:after="120" w:line="300" w:lineRule="auto"/>
+      </w:pPr>
+      <w:r>
+        <w:rPr>
+          <w:rFonts w:ascii="微软雅黑" w:hAnsi="微软雅黑" w:eastAsia="微软雅黑"/>
+          <w:b w:val="0"/>
+          <w:sz w:val="20"/>
+        </w:rPr>
+        <w:t>下表汇总本场（或跨场）可核对的关键指标：基线 → 改进后 → 提升幅度。后续洞察PPT可直接做成对比页。</w:t>
+      </w:r>
+    </w:p>
+    <w:tbl>
+      <w:tblPr>
+        <w:tblStyle w:val="TableGrid"/>
+        <w:tblW w:type="auto" w:w="0"/>
+        <w:tblLook w:firstColumn="1" w:firstRow="1" w:lastColumn="0" w:lastRow="0" w:noHBand="0" w:noVBand="1" w:val="04A0"/>
+      </w:tblPr>
+      <w:tblGrid>
+        <w:gridCol w:w="1930"/>
+        <w:gridCol w:w="1930"/>
+        <w:gridCol w:w="1930"/>
+        <w:gridCol w:w="1930"/>
+        <w:gridCol w:w="1930"/>
+      </w:tblGrid>
+      <w:tr>
+        <w:tc>
+          <w:tcPr>
+            <w:tcW w:type="dxa" w:w="1930"/>
+            <w:shd w:fill="D9E2F3" w:val="clear"/>
+          </w:tcPr>
+          <w:p>
+            <w:r>
+              <w:rPr>
+                <w:rFonts w:ascii="微软雅黑" w:hAnsi="微软雅黑" w:eastAsia="微软雅黑"/>
+                <w:b/>
+                <w:sz w:val="20"/>
+              </w:rPr>
+              <w:t>指标</w:t>
+            </w:r>
+          </w:p>
+        </w:tc>
+        <w:tc>
+          <w:tcPr>
+            <w:tcW w:type="dxa" w:w="1930"/>
+            <w:shd w:fill="D9E2F3" w:val="clear"/>
+          </w:tcPr>
+          <w:p>
+            <w:r>
+              <w:rPr>
+                <w:rFonts w:ascii="微软雅黑" w:hAnsi="微软雅黑" w:eastAsia="微软雅黑"/>
+                <w:b/>
+                <w:sz w:val="20"/>
+              </w:rPr>
+              <w:t>基线/对照</w:t>
+            </w:r>
+          </w:p>
+        </w:tc>
+        <w:tc>
+          <w:tcPr>
+            <w:tcW w:type="dxa" w:w="1930"/>
+            <w:shd w:fill="D9E2F3" w:val="clear"/>
+          </w:tcPr>
+          <w:p>
+            <w:r>
+              <w:rPr>
+                <w:rFonts w:ascii="微软雅黑" w:hAnsi="微软雅黑" w:eastAsia="微软雅黑"/>
+                <w:b/>
+                <w:sz w:val="20"/>
+              </w:rPr>
+              <w:t>改进后/方案</w:t>
+            </w:r>
+          </w:p>
+        </w:tc>
+        <w:tc>
+          <w:tcPr>
+            <w:tcW w:type="dxa" w:w="1930"/>
+            <w:shd w:fill="D9E2F3" w:val="clear"/>
+          </w:tcPr>
+          <w:p>
+            <w:r>
+              <w:rPr>
+                <w:rFonts w:ascii="微软雅黑" w:hAnsi="微软雅黑" w:eastAsia="微软雅黑"/>
+                <w:b/>
+                <w:sz w:val="20"/>
+              </w:rPr>
+              <w:t>提升/变化</w:t>
+            </w:r>
+          </w:p>
+        </w:tc>
+        <w:tc>
+          <w:tcPr>
+            <w:tcW w:type="dxa" w:w="1930"/>
+            <w:shd w:fill="D9E2F3" w:val="clear"/>
+          </w:tcPr>
+          <w:p>
+            <w:r>
+              <w:rPr>
+                <w:rFonts w:ascii="微软雅黑" w:hAnsi="微软雅黑" w:eastAsia="微软雅黑"/>
+                <w:b/>
+                <w:sz w:val="20"/>
+              </w:rPr>
+              <w:t>出处</w:t>
+            </w:r>
+          </w:p>
+        </w:tc>
+      </w:tr>
+      <w:tr>
+        <w:tc>
+          <w:tcPr>
+            <w:tcW w:type="dxa" w:w="1930"/>
+          </w:tcPr>
+          <w:p>
+            <w:r>
+              <w:rPr>
+                <w:rFonts w:ascii="微软雅黑" w:hAnsi="微软雅黑" w:eastAsia="微软雅黑"/>
+                <w:b w:val="0"/>
+                <w:sz w:val="18"/>
+              </w:rPr>
+              <w:t>运维工单处理时长</w:t>
+            </w:r>
+          </w:p>
+        </w:tc>
+        <w:tc>
+          <w:tcPr>
+            <w:tcW w:type="dxa" w:w="1930"/>
+          </w:tcPr>
+          <w:p>
+            <w:r>
+              <w:rPr>
+                <w:rFonts w:ascii="微软雅黑" w:hAnsi="微软雅黑" w:eastAsia="微软雅黑"/>
+                <w:b w:val="0"/>
+                <w:sz w:val="18"/>
+              </w:rPr>
+              <w:t>5.5 h</w:t>
+            </w:r>
+          </w:p>
+        </w:tc>
+        <w:tc>
+          <w:tcPr>
+            <w:tcW w:type="dxa" w:w="1930"/>
+          </w:tcPr>
+          <w:p>
+            <w:r>
+              <w:rPr>
+                <w:rFonts w:ascii="微软雅黑" w:hAnsi="微软雅黑" w:eastAsia="微软雅黑"/>
+                <w:b w:val="0"/>
+                <w:sz w:val="18"/>
+              </w:rPr>
+              <w:t>0.47 h</w:t>
+            </w:r>
+          </w:p>
+        </w:tc>
+        <w:tc>
+          <w:tcPr>
+            <w:tcW w:type="dxa" w:w="1930"/>
+          </w:tcPr>
+          <w:p>
+            <w:r>
+              <w:rPr>
+                <w:rFonts w:ascii="微软雅黑" w:hAnsi="微软雅黑" w:eastAsia="微软雅黑"/>
+                <w:b/>
+                <w:sz w:val="18"/>
+              </w:rPr>
+              <w:t>约 -91% / 人效 ~12×</w:t>
+            </w:r>
+          </w:p>
+        </w:tc>
+        <w:tc>
+          <w:tcPr>
+            <w:tcW w:type="dxa" w:w="1930"/>
+          </w:tcPr>
+          <w:p>
+            <w:r>
+              <w:rPr>
+                <w:rFonts w:ascii="微软雅黑" w:hAnsi="微软雅黑" w:eastAsia="微软雅黑"/>
+                <w:b w:val="0"/>
+                <w:sz w:val="18"/>
+              </w:rPr>
+              <w:t>Talk3 Infini-AIOps</w:t>
+            </w:r>
+          </w:p>
+        </w:tc>
+      </w:tr>
+      <w:tr>
+        <w:tc>
+          <w:tcPr>
+            <w:tcW w:type="dxa" w:w="1930"/>
+          </w:tcPr>
+          <w:p>
+            <w:r>
+              <w:rPr>
+                <w:rFonts w:ascii="微软雅黑" w:hAnsi="微软雅黑" w:eastAsia="微软雅黑"/>
+                <w:b w:val="0"/>
+                <w:sz w:val="18"/>
+              </w:rPr>
+              <w:t>训练网络有效带宽（多路径喷洒）</w:t>
+            </w:r>
+          </w:p>
+        </w:tc>
+        <w:tc>
+          <w:tcPr>
+            <w:tcW w:type="dxa" w:w="1930"/>
+          </w:tcPr>
+          <w:p>
+            <w:r>
+              <w:rPr>
+                <w:rFonts w:ascii="微软雅黑" w:hAnsi="微软雅黑" w:eastAsia="微软雅黑"/>
+                <w:b w:val="0"/>
+                <w:sz w:val="18"/>
+              </w:rPr>
+              <w:t>ECMP 冲突场景</w:t>
+            </w:r>
+          </w:p>
+        </w:tc>
+        <w:tc>
+          <w:tcPr>
+            <w:tcW w:type="dxa" w:w="1930"/>
+          </w:tcPr>
+          <w:p>
+            <w:r>
+              <w:rPr>
+                <w:rFonts w:ascii="微软雅黑" w:hAnsi="微软雅黑" w:eastAsia="微软雅黑"/>
+                <w:b w:val="0"/>
+                <w:sz w:val="18"/>
+              </w:rPr>
+              <w:t>喷洒后</w:t>
+            </w:r>
+          </w:p>
+        </w:tc>
+        <w:tc>
+          <w:tcPr>
+            <w:tcW w:type="dxa" w:w="1930"/>
+          </w:tcPr>
+          <w:p>
+            <w:r>
+              <w:rPr>
+                <w:rFonts w:ascii="微软雅黑" w:hAnsi="微软雅黑" w:eastAsia="微软雅黑"/>
+                <w:b/>
+                <w:sz w:val="18"/>
+              </w:rPr>
+              <w:t>约 +60%</w:t>
+            </w:r>
+          </w:p>
+        </w:tc>
+        <w:tc>
+          <w:tcPr>
+            <w:tcW w:type="dxa" w:w="1930"/>
+          </w:tcPr>
+          <w:p>
+            <w:r>
+              <w:rPr>
+                <w:rFonts w:ascii="微软雅黑" w:hAnsi="微软雅黑" w:eastAsia="微软雅黑"/>
+                <w:b w:val="0"/>
+                <w:sz w:val="18"/>
+              </w:rPr>
+              <w:t>Talk1 CIPU</w:t>
+            </w:r>
+          </w:p>
+        </w:tc>
+      </w:tr>
+      <w:tr>
+        <w:tc>
+          <w:tcPr>
+            <w:tcW w:type="dxa" w:w="1930"/>
+          </w:tcPr>
+          <w:p>
+            <w:r>
+              <w:rPr>
+                <w:rFonts w:ascii="微软雅黑" w:hAnsi="微软雅黑" w:eastAsia="微软雅黑"/>
+                <w:b w:val="0"/>
+                <w:sz w:val="18"/>
+              </w:rPr>
+              <w:t>SACK goodput（5% 丢包）</w:t>
+            </w:r>
+          </w:p>
+        </w:tc>
+        <w:tc>
+          <w:tcPr>
+            <w:tcW w:type="dxa" w:w="1930"/>
+          </w:tcPr>
+          <w:p>
+            <w:r>
+              <w:rPr>
+                <w:rFonts w:ascii="微软雅黑" w:hAnsi="微软雅黑" w:eastAsia="微软雅黑"/>
+                <w:b w:val="0"/>
+                <w:sz w:val="18"/>
+              </w:rPr>
+              <w:t>Go-back-N</w:t>
+            </w:r>
+          </w:p>
+        </w:tc>
+        <w:tc>
+          <w:tcPr>
+            <w:tcW w:type="dxa" w:w="1930"/>
+          </w:tcPr>
+          <w:p>
+            <w:r>
+              <w:rPr>
+                <w:rFonts w:ascii="微软雅黑" w:hAnsi="微软雅黑" w:eastAsia="微软雅黑"/>
+                <w:b w:val="0"/>
+                <w:sz w:val="18"/>
+              </w:rPr>
+              <w:t>SACK</w:t>
+            </w:r>
+          </w:p>
+        </w:tc>
+        <w:tc>
+          <w:tcPr>
+            <w:tcW w:type="dxa" w:w="1930"/>
+          </w:tcPr>
+          <w:p>
+            <w:r>
+              <w:rPr>
+                <w:rFonts w:ascii="微软雅黑" w:hAnsi="微软雅黑" w:eastAsia="微软雅黑"/>
+                <w:b/>
+                <w:sz w:val="18"/>
+              </w:rPr>
+              <w:t>约 90% goodput</w:t>
+            </w:r>
+          </w:p>
+        </w:tc>
+        <w:tc>
+          <w:tcPr>
+            <w:tcW w:type="dxa" w:w="1930"/>
+          </w:tcPr>
+          <w:p>
+            <w:r>
+              <w:rPr>
+                <w:rFonts w:ascii="微软雅黑" w:hAnsi="微软雅黑" w:eastAsia="微软雅黑"/>
+                <w:b w:val="0"/>
+                <w:sz w:val="18"/>
+              </w:rPr>
+              <w:t>Talk1 CIPU</w:t>
+            </w:r>
+          </w:p>
+        </w:tc>
+      </w:tr>
+      <w:tr>
+        <w:tc>
+          <w:tcPr>
+            <w:tcW w:type="dxa" w:w="1930"/>
+          </w:tcPr>
+          <w:p>
+            <w:r>
+              <w:rPr>
+                <w:rFonts w:ascii="微软雅黑" w:hAnsi="微软雅黑" w:eastAsia="微软雅黑"/>
+                <w:b w:val="0"/>
+                <w:sz w:val="18"/>
+              </w:rPr>
+              <w:t>KVCache offload 吞吐 / TTFT</w:t>
+            </w:r>
+          </w:p>
+        </w:tc>
+        <w:tc>
+          <w:tcPr>
+            <w:tcW w:type="dxa" w:w="1930"/>
+          </w:tcPr>
+          <w:p>
+            <w:r>
+              <w:rPr>
+                <w:rFonts w:ascii="微软雅黑" w:hAnsi="微软雅黑" w:eastAsia="微软雅黑"/>
+                <w:b w:val="0"/>
+                <w:sz w:val="18"/>
+              </w:rPr>
+              <w:t>未池化/未 offload</w:t>
+            </w:r>
+          </w:p>
+        </w:tc>
+        <w:tc>
+          <w:tcPr>
+            <w:tcW w:type="dxa" w:w="1930"/>
+          </w:tcPr>
+          <w:p>
+            <w:r>
+              <w:rPr>
+                <w:rFonts w:ascii="微软雅黑" w:hAnsi="微软雅黑" w:eastAsia="微软雅黑"/>
+                <w:b w:val="0"/>
+                <w:sz w:val="18"/>
+              </w:rPr>
+              <w:t>Tair Memory Pool</w:t>
+            </w:r>
+          </w:p>
+        </w:tc>
+        <w:tc>
+          <w:tcPr>
+            <w:tcW w:type="dxa" w:w="1930"/>
+          </w:tcPr>
+          <w:p>
+            <w:r>
+              <w:rPr>
+                <w:rFonts w:ascii="微软雅黑" w:hAnsi="微软雅黑" w:eastAsia="微软雅黑"/>
+                <w:b/>
+                <w:sz w:val="18"/>
+              </w:rPr>
+              <w:t>吞吐 +50%+ / TTFT -30%</w:t>
+            </w:r>
+          </w:p>
+        </w:tc>
+        <w:tc>
+          <w:tcPr>
+            <w:tcW w:type="dxa" w:w="1930"/>
+          </w:tcPr>
+          <w:p>
+            <w:r>
+              <w:rPr>
+                <w:rFonts w:ascii="微软雅黑" w:hAnsi="微软雅黑" w:eastAsia="微软雅黑"/>
+                <w:b w:val="0"/>
+                <w:sz w:val="18"/>
+              </w:rPr>
+              <w:t>Talk4</w:t>
+            </w:r>
+          </w:p>
+        </w:tc>
+      </w:tr>
+      <w:tr>
+        <w:tc>
+          <w:tcPr>
+            <w:tcW w:type="dxa" w:w="1930"/>
+          </w:tcPr>
+          <w:p>
+            <w:r>
+              <w:rPr>
+                <w:rFonts w:ascii="微软雅黑" w:hAnsi="微软雅黑" w:eastAsia="微软雅黑"/>
+                <w:b w:val="0"/>
+                <w:sz w:val="18"/>
+              </w:rPr>
+              <w:t>AL144 vs AL128 单柜 Scale-up</w:t>
+            </w:r>
+          </w:p>
+        </w:tc>
+        <w:tc>
+          <w:tcPr>
+            <w:tcW w:type="dxa" w:w="1930"/>
+          </w:tcPr>
+          <w:p>
+            <w:r>
+              <w:rPr>
+                <w:rFonts w:ascii="微软雅黑" w:hAnsi="微软雅黑" w:eastAsia="微软雅黑"/>
+                <w:b w:val="0"/>
+                <w:sz w:val="18"/>
+              </w:rPr>
+              <w:t>AL128</w:t>
+            </w:r>
+          </w:p>
+        </w:tc>
+        <w:tc>
+          <w:tcPr>
+            <w:tcW w:type="dxa" w:w="1930"/>
+          </w:tcPr>
+          <w:p>
+            <w:r>
+              <w:rPr>
+                <w:rFonts w:ascii="微软雅黑" w:hAnsi="微软雅黑" w:eastAsia="微软雅黑"/>
+                <w:b w:val="0"/>
+                <w:sz w:val="18"/>
+              </w:rPr>
+              <w:t>AL144</w:t>
+            </w:r>
+          </w:p>
+        </w:tc>
+        <w:tc>
+          <w:tcPr>
+            <w:tcW w:type="dxa" w:w="1930"/>
+          </w:tcPr>
+          <w:p>
+            <w:r>
+              <w:rPr>
+                <w:rFonts w:ascii="微软雅黑" w:hAnsi="微软雅黑" w:eastAsia="微软雅黑"/>
+                <w:b/>
+                <w:sz w:val="18"/>
+              </w:rPr>
+              <w:t>144 卡（约 2×）</w:t>
+            </w:r>
+          </w:p>
+        </w:tc>
+        <w:tc>
+          <w:tcPr>
+            <w:tcW w:type="dxa" w:w="1930"/>
+          </w:tcPr>
+          <w:p>
+            <w:r>
+              <w:rPr>
+                <w:rFonts w:ascii="微软雅黑" w:hAnsi="微软雅黑" w:eastAsia="微软雅黑"/>
+                <w:b w:val="0"/>
+                <w:sz w:val="18"/>
+              </w:rPr>
+              <w:t>Talk6</w:t>
+            </w:r>
+          </w:p>
+        </w:tc>
+      </w:tr>
+      <w:tr>
+        <w:tc>
+          <w:tcPr>
+            <w:tcW w:type="dxa" w:w="1930"/>
+          </w:tcPr>
+          <w:p>
+            <w:r>
+              <w:rPr>
+                <w:rFonts w:ascii="微软雅黑" w:hAnsi="微软雅黑" w:eastAsia="微软雅黑"/>
+                <w:b w:val="0"/>
+                <w:sz w:val="18"/>
+              </w:rPr>
+              <w:t>AL144 单柜功率</w:t>
+            </w:r>
+          </w:p>
+        </w:tc>
+        <w:tc>
+          <w:tcPr>
+            <w:tcW w:type="dxa" w:w="1930"/>
+          </w:tcPr>
+          <w:p>
+            <w:r>
+              <w:rPr>
+                <w:rFonts w:ascii="微软雅黑" w:hAnsi="微软雅黑" w:eastAsia="微软雅黑"/>
+                <w:b w:val="0"/>
+                <w:sz w:val="18"/>
+              </w:rPr>
+              <w:t>AL128</w:t>
+            </w:r>
+          </w:p>
+        </w:tc>
+        <w:tc>
+          <w:tcPr>
+            <w:tcW w:type="dxa" w:w="1930"/>
+          </w:tcPr>
+          <w:p>
+            <w:r>
+              <w:rPr>
+                <w:rFonts w:ascii="微软雅黑" w:hAnsi="微软雅黑" w:eastAsia="微软雅黑"/>
+                <w:b w:val="0"/>
+                <w:sz w:val="18"/>
+              </w:rPr>
+              <w:t>750 kW</w:t>
+            </w:r>
+          </w:p>
+        </w:tc>
+        <w:tc>
+          <w:tcPr>
+            <w:tcW w:type="dxa" w:w="1930"/>
+          </w:tcPr>
+          <w:p>
+            <w:r>
+              <w:rPr>
+                <w:rFonts w:ascii="微软雅黑" w:hAnsi="微软雅黑" w:eastAsia="微软雅黑"/>
+                <w:b/>
+                <w:sz w:val="18"/>
+              </w:rPr>
+              <w:t>约 2.15×</w:t>
+            </w:r>
+          </w:p>
+        </w:tc>
+        <w:tc>
+          <w:tcPr>
+            <w:tcW w:type="dxa" w:w="1930"/>
+          </w:tcPr>
+          <w:p>
+            <w:r>
+              <w:rPr>
+                <w:rFonts w:ascii="微软雅黑" w:hAnsi="微软雅黑" w:eastAsia="微软雅黑"/>
+                <w:b w:val="0"/>
+                <w:sz w:val="18"/>
+              </w:rPr>
+              <w:t>Talk6</w:t>
+            </w:r>
+          </w:p>
+        </w:tc>
+      </w:tr>
+      <w:tr>
+        <w:tc>
+          <w:tcPr>
+            <w:tcW w:type="dxa" w:w="1930"/>
+          </w:tcPr>
+          <w:p>
+            <w:r>
+              <w:rPr>
+                <w:rFonts w:ascii="微软雅黑" w:hAnsi="微软雅黑" w:eastAsia="微软雅黑"/>
+                <w:b w:val="0"/>
+                <w:sz w:val="18"/>
+              </w:rPr>
+              <w:t>大 EP 推理性能</w:t>
+            </w:r>
+          </w:p>
+        </w:tc>
+        <w:tc>
+          <w:tcPr>
+            <w:tcW w:type="dxa" w:w="1930"/>
+          </w:tcPr>
+          <w:p>
+            <w:r>
+              <w:rPr>
+                <w:rFonts w:ascii="微软雅黑" w:hAnsi="微软雅黑" w:eastAsia="微软雅黑"/>
+                <w:b w:val="0"/>
+                <w:sz w:val="18"/>
+              </w:rPr>
+              <w:t>非超节点/前代</w:t>
+            </w:r>
+          </w:p>
+        </w:tc>
+        <w:tc>
+          <w:tcPr>
+            <w:tcW w:type="dxa" w:w="1930"/>
+          </w:tcPr>
+          <w:p>
+            <w:r>
+              <w:rPr>
+                <w:rFonts w:ascii="微软雅黑" w:hAnsi="微软雅黑" w:eastAsia="微软雅黑"/>
+                <w:b w:val="0"/>
+                <w:sz w:val="18"/>
+              </w:rPr>
+              <w:t>超节点</w:t>
+            </w:r>
+          </w:p>
+        </w:tc>
+        <w:tc>
+          <w:tcPr>
+            <w:tcW w:type="dxa" w:w="1930"/>
+          </w:tcPr>
+          <w:p>
+            <w:r>
+              <w:rPr>
+                <w:rFonts w:ascii="微软雅黑" w:hAnsi="微软雅黑" w:eastAsia="微软雅黑"/>
+                <w:b/>
+                <w:sz w:val="18"/>
+              </w:rPr>
+              <w:t>&gt;40%</w:t>
+            </w:r>
+          </w:p>
+        </w:tc>
+        <w:tc>
+          <w:tcPr>
+            <w:tcW w:type="dxa" w:w="1930"/>
+          </w:tcPr>
+          <w:p>
+            <w:r>
+              <w:rPr>
+                <w:rFonts w:ascii="微软雅黑" w:hAnsi="微软雅黑" w:eastAsia="微软雅黑"/>
+                <w:b w:val="0"/>
+                <w:sz w:val="18"/>
+              </w:rPr>
+              <w:t>Talk6</w:t>
+            </w:r>
+          </w:p>
+        </w:tc>
+      </w:tr>
+      <w:tr>
+        <w:tc>
+          <w:tcPr>
+            <w:tcW w:type="dxa" w:w="1930"/>
+          </w:tcPr>
+          <w:p>
+            <w:r>
+              <w:rPr>
+                <w:rFonts w:ascii="微软雅黑" w:hAnsi="微软雅黑" w:eastAsia="微软雅黑"/>
+                <w:b w:val="0"/>
+                <w:sz w:val="18"/>
+              </w:rPr>
+              <w:t>Kernel Agent 案例（H100 BF16）</w:t>
+            </w:r>
+          </w:p>
+        </w:tc>
+        <w:tc>
+          <w:tcPr>
+            <w:tcW w:type="dxa" w:w="1930"/>
+          </w:tcPr>
+          <w:p>
+            <w:r>
+              <w:rPr>
+                <w:rFonts w:ascii="微软雅黑" w:hAnsi="微软雅黑" w:eastAsia="微软雅黑"/>
+                <w:b w:val="0"/>
+                <w:sz w:val="18"/>
+              </w:rPr>
+              <w:t>9.52 ms</w:t>
+            </w:r>
+          </w:p>
+        </w:tc>
+        <w:tc>
+          <w:tcPr>
+            <w:tcW w:type="dxa" w:w="1930"/>
+          </w:tcPr>
+          <w:p>
+            <w:r>
+              <w:rPr>
+                <w:rFonts w:ascii="微软雅黑" w:hAnsi="微软雅黑" w:eastAsia="微软雅黑"/>
+                <w:b w:val="0"/>
+                <w:sz w:val="18"/>
+              </w:rPr>
+              <w:t>1.95 ms</w:t>
+            </w:r>
+          </w:p>
+        </w:tc>
+        <w:tc>
+          <w:tcPr>
+            <w:tcW w:type="dxa" w:w="1930"/>
+          </w:tcPr>
+          <w:p>
+            <w:r>
+              <w:rPr>
+                <w:rFonts w:ascii="微软雅黑" w:hAnsi="微软雅黑" w:eastAsia="微软雅黑"/>
+                <w:b/>
+                <w:sz w:val="18"/>
+              </w:rPr>
+              <w:t>约 4.88×</w:t>
+            </w:r>
+          </w:p>
+        </w:tc>
+        <w:tc>
+          <w:tcPr>
+            <w:tcW w:type="dxa" w:w="1930"/>
+          </w:tcPr>
+          <w:p>
+            <w:r>
+              <w:rPr>
+                <w:rFonts w:ascii="微软雅黑" w:hAnsi="微软雅黑" w:eastAsia="微软雅黑"/>
+                <w:b w:val="0"/>
+                <w:sz w:val="18"/>
+              </w:rPr>
+              <w:t>Talk7</w:t>
+            </w:r>
+          </w:p>
+        </w:tc>
+      </w:tr>
+      <w:tr>
+        <w:tc>
+          <w:tcPr>
+            <w:tcW w:type="dxa" w:w="1930"/>
+          </w:tcPr>
+          <w:p>
+            <w:r>
+              <w:rPr>
+                <w:rFonts w:ascii="微软雅黑" w:hAnsi="微软雅黑" w:eastAsia="微软雅黑"/>
+                <w:b w:val="0"/>
+                <w:sz w:val="18"/>
+              </w:rPr>
+              <w:t>Hisim 仿真准确率</w:t>
+            </w:r>
+          </w:p>
+        </w:tc>
+        <w:tc>
+          <w:tcPr>
+            <w:tcW w:type="dxa" w:w="1930"/>
+          </w:tcPr>
+          <w:p>
+            <w:r>
+              <w:rPr>
+                <w:rFonts w:ascii="微软雅黑" w:hAnsi="微软雅黑" w:eastAsia="微软雅黑"/>
+                <w:b w:val="0"/>
+                <w:sz w:val="18"/>
+              </w:rPr>
+              <w:t>—</w:t>
+            </w:r>
+          </w:p>
+        </w:tc>
+        <w:tc>
+          <w:tcPr>
+            <w:tcW w:type="dxa" w:w="1930"/>
+          </w:tcPr>
+          <w:p>
+            <w:r>
+              <w:rPr>
+                <w:rFonts w:ascii="微软雅黑" w:hAnsi="微软雅黑" w:eastAsia="微软雅黑"/>
+                <w:b w:val="0"/>
+                <w:sz w:val="18"/>
+              </w:rPr>
+              <w:t>整体 96%+</w:t>
+            </w:r>
+          </w:p>
+        </w:tc>
+        <w:tc>
+          <w:tcPr>
+            <w:tcW w:type="dxa" w:w="1930"/>
+          </w:tcPr>
+          <w:p>
+            <w:r>
+              <w:rPr>
+                <w:rFonts w:ascii="微软雅黑" w:hAnsi="微软雅黑" w:eastAsia="微软雅黑"/>
+                <w:b/>
+                <w:sz w:val="18"/>
+              </w:rPr>
+              <w:t>高保真选型前移</w:t>
+            </w:r>
+          </w:p>
+        </w:tc>
+        <w:tc>
+          <w:tcPr>
+            <w:tcW w:type="dxa" w:w="1930"/>
+          </w:tcPr>
+          <w:p>
+            <w:r>
+              <w:rPr>
+                <w:rFonts w:ascii="微软雅黑" w:hAnsi="微软雅黑" w:eastAsia="微软雅黑"/>
+                <w:b w:val="0"/>
+                <w:sz w:val="18"/>
+              </w:rPr>
+              <w:t>Talk8</w:t>
+            </w:r>
+          </w:p>
+        </w:tc>
+      </w:tr>
+      <w:tr>
+        <w:tc>
+          <w:tcPr>
+            <w:tcW w:type="dxa" w:w="1930"/>
+          </w:tcPr>
+          <w:p>
+            <w:r>
+              <w:rPr>
+                <w:rFonts w:ascii="微软雅黑" w:hAnsi="微软雅黑" w:eastAsia="微软雅黑"/>
+                <w:b w:val="0"/>
+                <w:sz w:val="18"/>
+              </w:rPr>
+              <w:t>CPU:GPU 配比（Agentic）</w:t>
+            </w:r>
+          </w:p>
+        </w:tc>
+        <w:tc>
+          <w:tcPr>
+            <w:tcW w:type="dxa" w:w="1930"/>
+          </w:tcPr>
+          <w:p>
+            <w:r>
+              <w:rPr>
+                <w:rFonts w:ascii="微软雅黑" w:hAnsi="微软雅黑" w:eastAsia="微软雅黑"/>
+                <w:b w:val="0"/>
+                <w:sz w:val="18"/>
+              </w:rPr>
+              <w:t>约 1:8（生成式）</w:t>
+            </w:r>
+          </w:p>
+        </w:tc>
+        <w:tc>
+          <w:tcPr>
+            <w:tcW w:type="dxa" w:w="1930"/>
+          </w:tcPr>
+          <w:p>
+            <w:r>
+              <w:rPr>
+                <w:rFonts w:ascii="微软雅黑" w:hAnsi="微软雅黑" w:eastAsia="微软雅黑"/>
+                <w:b w:val="0"/>
+                <w:sz w:val="18"/>
+              </w:rPr>
+              <w:t>约 1:1～1:2</w:t>
+            </w:r>
+          </w:p>
+        </w:tc>
+        <w:tc>
+          <w:tcPr>
+            <w:tcW w:type="dxa" w:w="1930"/>
+          </w:tcPr>
+          <w:p>
+            <w:r>
+              <w:rPr>
+                <w:rFonts w:ascii="微软雅黑" w:hAnsi="微软雅黑" w:eastAsia="微软雅黑"/>
+                <w:b/>
+                <w:sz w:val="18"/>
+              </w:rPr>
+              <w:t>每 GW CPU 核数约 4×</w:t>
+            </w:r>
+          </w:p>
+        </w:tc>
+        <w:tc>
+          <w:tcPr>
+            <w:tcW w:type="dxa" w:w="1930"/>
+          </w:tcPr>
+          <w:p>
+            <w:r>
+              <w:rPr>
+                <w:rFonts w:ascii="微软雅黑" w:hAnsi="微软雅黑" w:eastAsia="微软雅黑"/>
+                <w:b w:val="0"/>
+                <w:sz w:val="18"/>
+              </w:rPr>
+              <w:t>Talk2</w:t>
+            </w:r>
+          </w:p>
+        </w:tc>
+      </w:tr>
+    </w:tbl>
+    <w:p/>
+    <w:p>
+      <w:pPr>
+        <w:pStyle w:val="Heading2"/>
+      </w:pPr>
+      <w:r>
+        <w:rPr>
+          <w:rFonts w:ascii="微软雅黑" w:hAnsi="微软雅黑" w:eastAsia="微软雅黑"/>
+          <w:b/>
+          <w:sz w:val="26"/>
+        </w:rPr>
+        <w:t>四、技术展开与PPT佐证</w:t>
       </w:r>
     </w:p>
     <w:p>
@@ -601,7 +1494,7 @@
           <w:b/>
           <w:sz w:val="26"/>
         </w:rPr>
-        <w:t>四、面向未来的洞察（洞察PPT素材）</w:t>
+        <w:t>五、面向未来的洞察（洞察PPT素材）</w:t>
       </w:r>
     </w:p>
     <w:p>
@@ -614,7 +1507,7 @@
           <w:b w:val="0"/>
           <w:sz w:val="20"/>
         </w:rPr>
-        <w:t>本节可直接拆成洞察PPT的判断页/动作页/金句页。</w:t>
+        <w:t>本节可直接拆成洞察PPT的判断页/对比页/动作页/金句页；指标对比见上文表格。</w:t>
       </w:r>
     </w:p>
     <w:p>
@@ -835,6 +1728,20 @@
           <w:sz w:val="22"/>
         </w:rPr>
         <w:t>金句候选：算力廉价、数据访问昂贵；停得久≠价值低；先拆分再堆料，先仿真再到柜。</w:t>
+      </w:r>
+    </w:p>
+    <w:p>
+      <w:pPr>
+        <w:pStyle w:val="ListBullet"/>
+        <w:spacing w:after="60"/>
+      </w:pPr>
+      <w:r>
+        <w:rPr>
+          <w:rFonts w:ascii="微软雅黑" w:hAnsi="微软雅黑" w:eastAsia="微软雅黑"/>
+          <w:b w:val="0"/>
+          <w:sz w:val="22"/>
+        </w:rPr>
+        <w:t>页建议：跨场关键指标对比总表（时长/带宽/加速比/准确率一页呈现）。</w:t>
       </w:r>
     </w:p>
     <w:sectPr>

</xml_diff>